<commit_message>
fix: docs reference to move the esign to the signature field
</commit_message>
<xml_diff>
--- a/reference-forms/doc-forms/ANNEX-D-PERSONAL-TRAVEL-AUTHORITY_SAMPLE.docx
+++ b/reference-forms/doc-forms/ANNEX-D-PERSONAL-TRAVEL-AUTHORITY_SAMPLE.docx
@@ -113,7 +113,21 @@
               <w:rPr>
                 <w:rFonts w:asciiTheme="minorHAnsi" w:hAnsiTheme="minorHAnsi" w:cstheme="minorHAnsi"/>
               </w:rPr>
-              <w:t>${employee_name}</w:t>
+              <w:t>${</w:t>
+            </w:r>
+            <w:proofErr w:type="spellStart"/>
+            <w:r>
+              <w:rPr>
+                <w:rFonts w:asciiTheme="minorHAnsi" w:hAnsiTheme="minorHAnsi" w:cstheme="minorHAnsi"/>
+              </w:rPr>
+              <w:t>employee_name</w:t>
+            </w:r>
+            <w:proofErr w:type="spellEnd"/>
+            <w:r>
+              <w:rPr>
+                <w:rFonts w:asciiTheme="minorHAnsi" w:hAnsiTheme="minorHAnsi" w:cstheme="minorHAnsi"/>
+              </w:rPr>
+              <w:t>}</w:t>
             </w:r>
           </w:p>
         </w:tc>
@@ -162,7 +176,21 @@
               <w:rPr>
                 <w:rFonts w:asciiTheme="minorHAnsi" w:hAnsiTheme="minorHAnsi" w:cstheme="minorHAnsi"/>
               </w:rPr>
-              <w:t>${employee_position}</w:t>
+              <w:t>${</w:t>
+            </w:r>
+            <w:proofErr w:type="spellStart"/>
+            <w:r>
+              <w:rPr>
+                <w:rFonts w:asciiTheme="minorHAnsi" w:hAnsiTheme="minorHAnsi" w:cstheme="minorHAnsi"/>
+              </w:rPr>
+              <w:t>employee_position</w:t>
+            </w:r>
+            <w:proofErr w:type="spellEnd"/>
+            <w:r>
+              <w:rPr>
+                <w:rFonts w:asciiTheme="minorHAnsi" w:hAnsiTheme="minorHAnsi" w:cstheme="minorHAnsi"/>
+              </w:rPr>
+              <w:t>}</w:t>
             </w:r>
           </w:p>
         </w:tc>
@@ -211,7 +239,21 @@
               <w:rPr>
                 <w:rFonts w:asciiTheme="minorHAnsi" w:hAnsiTheme="minorHAnsi" w:cstheme="minorHAnsi"/>
               </w:rPr>
-              <w:t>${permanent_station}</w:t>
+              <w:t>${</w:t>
+            </w:r>
+            <w:proofErr w:type="spellStart"/>
+            <w:r>
+              <w:rPr>
+                <w:rFonts w:asciiTheme="minorHAnsi" w:hAnsiTheme="minorHAnsi" w:cstheme="minorHAnsi"/>
+              </w:rPr>
+              <w:t>permanent_station</w:t>
+            </w:r>
+            <w:proofErr w:type="spellEnd"/>
+            <w:r>
+              <w:rPr>
+                <w:rFonts w:asciiTheme="minorHAnsi" w:hAnsiTheme="minorHAnsi" w:cstheme="minorHAnsi"/>
+              </w:rPr>
+              <w:t>}</w:t>
             </w:r>
           </w:p>
         </w:tc>
@@ -260,7 +302,21 @@
               <w:rPr>
                 <w:rFonts w:asciiTheme="minorHAnsi" w:hAnsiTheme="minorHAnsi" w:cstheme="minorHAnsi"/>
               </w:rPr>
-              <w:t>${inclusive_dates}</w:t>
+              <w:t>${</w:t>
+            </w:r>
+            <w:proofErr w:type="spellStart"/>
+            <w:r>
+              <w:rPr>
+                <w:rFonts w:asciiTheme="minorHAnsi" w:hAnsiTheme="minorHAnsi" w:cstheme="minorHAnsi"/>
+              </w:rPr>
+              <w:t>inclusive_dates</w:t>
+            </w:r>
+            <w:proofErr w:type="spellEnd"/>
+            <w:r>
+              <w:rPr>
+                <w:rFonts w:asciiTheme="minorHAnsi" w:hAnsiTheme="minorHAnsi" w:cstheme="minorHAnsi"/>
+              </w:rPr>
+              <w:t>}</w:t>
             </w:r>
           </w:p>
         </w:tc>
@@ -405,7 +461,15 @@
                                     <w:jc w:val="center"/>
                                   </w:pPr>
                                   <w:r>
-                                    <w:t>${request_date}</w:t>
+                                    <w:t>${</w:t>
+                                  </w:r>
+                                  <w:proofErr w:type="spellStart"/>
+                                  <w:r>
+                                    <w:t>request_date</w:t>
+                                  </w:r>
+                                  <w:proofErr w:type="spellEnd"/>
+                                  <w:r>
+                                    <w:t>}</w:t>
                                   </w:r>
                                 </w:p>
                               </w:txbxContent>
@@ -512,7 +576,15 @@
                                     <w:jc w:val="center"/>
                                   </w:pPr>
                                   <w:r>
-                                    <w:t>${requesting_employee_name}</w:t>
+                                    <w:t>${</w:t>
+                                  </w:r>
+                                  <w:proofErr w:type="spellStart"/>
+                                  <w:r>
+                                    <w:t>requesting_employee_name</w:t>
+                                  </w:r>
+                                  <w:proofErr w:type="spellEnd"/>
+                                  <w:r>
+                                    <w:t>}</w:t>
                                   </w:r>
                                 </w:p>
                               </w:txbxContent>
@@ -732,7 +804,15 @@
                                     <w:jc w:val="center"/>
                                   </w:pPr>
                                   <w:r>
-                                    <w:t>${approval_date}</w:t>
+                                    <w:t>${</w:t>
+                                  </w:r>
+                                  <w:proofErr w:type="spellStart"/>
+                                  <w:r>
+                                    <w:t>approval_date</w:t>
+                                  </w:r>
+                                  <w:proofErr w:type="spellEnd"/>
+                                  <w:r>
+                                    <w:t>}</w:t>
                                   </w:r>
                                 </w:p>
                               </w:txbxContent>
@@ -970,7 +1050,15 @@
                                     <w:jc w:val="center"/>
                                   </w:pPr>
                                   <w:r>
-                                    <w:t>${approval_date}</w:t>
+                                    <w:t>${</w:t>
+                                  </w:r>
+                                  <w:proofErr w:type="spellStart"/>
+                                  <w:r>
+                                    <w:t>approval_date</w:t>
+                                  </w:r>
+                                  <w:proofErr w:type="spellEnd"/>
+                                  <w:r>
+                                    <w:t>}</w:t>
                                   </w:r>
                                 </w:p>
                               </w:txbxContent>
@@ -1041,7 +1129,42 @@
                 <w:rFonts w:ascii="Bookman Old Style" w:hAnsi="Bookman Old Style"/>
                 <w:b/>
               </w:rPr>
-              <w:t>ATTY. ALBERTO T. ESCOBARTE, CESO II                  __________________</w:t>
+              <w:t>DR. CARLITO D. ROCAFORT, CESO III</w:t>
+            </w:r>
+            <w:r>
+              <w:rPr>
+                <w:rFonts w:ascii="Bookman Old Style" w:hAnsi="Bookman Old Style"/>
+                <w:b/>
+              </w:rPr>
+              <w:t xml:space="preserve">     </w:t>
+            </w:r>
+            <w:r>
+              <w:rPr>
+                <w:rFonts w:ascii="Bookman Old Style" w:hAnsi="Bookman Old Style"/>
+                <w:b/>
+              </w:rPr>
+              <w:t xml:space="preserve">  </w:t>
+            </w:r>
+            <w:r>
+              <w:rPr>
+                <w:rFonts w:ascii="Bookman Old Style" w:hAnsi="Bookman Old Style"/>
+                <w:b/>
+              </w:rPr>
+              <w:t xml:space="preserve"> </w:t>
+            </w:r>
+            <w:r>
+              <w:rPr>
+                <w:rFonts w:ascii="Bookman Old Style" w:hAnsi="Bookman Old Style"/>
+                <w:b/>
+              </w:rPr>
+              <w:t xml:space="preserve">               </w:t>
+            </w:r>
+            <w:r>
+              <w:rPr>
+                <w:rFonts w:ascii="Bookman Old Style" w:hAnsi="Bookman Old Style"/>
+                <w:b/>
+              </w:rPr>
+              <w:t>__________________</w:t>
             </w:r>
           </w:p>
           <w:p>
@@ -1063,7 +1186,21 @@
                 <w:rFonts w:ascii="Bookman Old Style" w:hAnsi="Bookman Old Style"/>
                 <w:sz w:val="20"/>
               </w:rPr>
-              <w:t>Regional Director                                                            Date</w:t>
+              <w:t xml:space="preserve">Regional Director                               </w:t>
+            </w:r>
+            <w:r>
+              <w:rPr>
+                <w:rFonts w:ascii="Bookman Old Style" w:hAnsi="Bookman Old Style"/>
+                <w:sz w:val="20"/>
+              </w:rPr>
+              <w:t xml:space="preserve"> </w:t>
+            </w:r>
+            <w:r>
+              <w:rPr>
+                <w:rFonts w:ascii="Bookman Old Style" w:hAnsi="Bookman Old Style"/>
+                <w:sz w:val="20"/>
+              </w:rPr>
+              <w:t xml:space="preserve">                             Date</w:t>
             </w:r>
           </w:p>
           <w:p>
@@ -1074,6 +1211,13 @@
                 <w:sz w:val="20"/>
               </w:rPr>
             </w:pPr>
+            <w:r>
+              <w:rPr>
+                <w:rFonts w:ascii="Bookman Old Style" w:hAnsi="Bookman Old Style"/>
+                <w:sz w:val="20"/>
+              </w:rPr>
+              <w:t xml:space="preserve">  </w:t>
+            </w:r>
           </w:p>
           <w:p>
             <w:pPr>
@@ -1344,7 +1488,23 @@
         <w:rFonts w:asciiTheme="minorHAnsi" w:hAnsiTheme="minorHAnsi" w:cstheme="minorHAnsi"/>
         <w:bCs/>
       </w:rPr>
-      <w:t>${at_tracking_no}</w:t>
+      <w:t>${</w:t>
+    </w:r>
+    <w:proofErr w:type="spellStart"/>
+    <w:r>
+      <w:rPr>
+        <w:rFonts w:asciiTheme="minorHAnsi" w:hAnsiTheme="minorHAnsi" w:cstheme="minorHAnsi"/>
+        <w:bCs/>
+      </w:rPr>
+      <w:t>at_tracking_no</w:t>
+    </w:r>
+    <w:proofErr w:type="spellEnd"/>
+    <w:r>
+      <w:rPr>
+        <w:rFonts w:asciiTheme="minorHAnsi" w:hAnsiTheme="minorHAnsi" w:cstheme="minorHAnsi"/>
+        <w:bCs/>
+      </w:rPr>
+      <w:t>}</w:t>
     </w:r>
     <w:r>
       <w:rPr>

</xml_diff>